<commit_message>
I add legal feasibility in software requirement.
</commit_message>
<xml_diff>
--- a/家具租賃系統_software_reruirements(第1版).docx
+++ b/家具租賃系統_software_reruirements(第1版).docx
@@ -110,8 +110,6 @@
         </w:rPr>
         <w:t>郭丞睿</w:t>
       </w:r>
-      <w:bookmarkStart w:id="0" w:name="_GoBack"/>
-      <w:bookmarkEnd w:id="0"/>
     </w:p>
     <w:p>
       <w:pPr>
@@ -212,9 +210,87 @@
         </w:rPr>
         <w:t>較好</w:t>
       </w:r>
+      <w:r>
+        <w:rPr>
+          <w:rFonts w:ascii="Times New Roman" w:eastAsia="標楷體" w:hAnsi="Times New Roman" w:cs="Times New Roman"/>
+          <w:kern w:val="0"/>
+          <w:szCs w:val="24"/>
+        </w:rPr>
+        <w:t>”</w:t>
+      </w:r>
+      <w:r>
+        <w:rPr>
+          <w:rFonts w:ascii="Times New Roman" w:eastAsia="標楷體" w:hAnsi="Times New Roman" w:cs="Times New Roman" w:hint="eastAsia"/>
+          <w:kern w:val="0"/>
+          <w:szCs w:val="24"/>
+        </w:rPr>
+        <w:t>的處理方式，但回收也不適</w:t>
+      </w:r>
       <w:proofErr w:type="gramStart"/>
       <w:r>
         <w:rPr>
+          <w:rFonts w:ascii="Times New Roman" w:eastAsia="標楷體" w:hAnsi="Times New Roman" w:cs="Times New Roman" w:hint="eastAsia"/>
+          <w:kern w:val="0"/>
+          <w:szCs w:val="24"/>
+        </w:rPr>
+        <w:t>萬能</w:t>
+      </w:r>
+      <w:proofErr w:type="gramEnd"/>
+      <w:r>
+        <w:rPr>
+          <w:rFonts w:ascii="Times New Roman" w:eastAsia="標楷體" w:hAnsi="Times New Roman" w:cs="Times New Roman" w:hint="eastAsia"/>
+          <w:kern w:val="0"/>
+          <w:szCs w:val="24"/>
+        </w:rPr>
+        <w:t>丹，不容忽視的是回收無法做到</w:t>
+      </w:r>
+      <w:r>
+        <w:rPr>
+          <w:rFonts w:ascii="Times New Roman" w:eastAsia="標楷體" w:hAnsi="Times New Roman" w:cs="Times New Roman" w:hint="eastAsia"/>
+          <w:kern w:val="0"/>
+          <w:szCs w:val="24"/>
+        </w:rPr>
+        <w:t>1</w:t>
+      </w:r>
+      <w:r>
+        <w:rPr>
+          <w:rFonts w:ascii="Times New Roman" w:eastAsia="標楷體" w:hAnsi="Times New Roman" w:cs="Times New Roman"/>
+          <w:kern w:val="0"/>
+          <w:szCs w:val="24"/>
+        </w:rPr>
+        <w:t>00%</w:t>
+      </w:r>
+      <w:r>
+        <w:rPr>
+          <w:rFonts w:ascii="Times New Roman" w:eastAsia="標楷體" w:hAnsi="Times New Roman" w:cs="Times New Roman" w:hint="eastAsia"/>
+          <w:kern w:val="0"/>
+          <w:szCs w:val="24"/>
+        </w:rPr>
+        <w:t>垃圾再利用處理，且回收過程中所需耗費的能源，更造成了額外經濟與環境成本支出。</w:t>
+      </w:r>
+    </w:p>
+    <w:p>
+      <w:pPr>
+        <w:widowControl/>
+        <w:shd w:val="clear" w:color="auto" w:fill="FFFFFF"/>
+        <w:ind w:firstLine="480"/>
+        <w:rPr>
+          <w:rFonts w:ascii="Times New Roman" w:eastAsia="標楷體" w:hAnsi="Times New Roman" w:cs="Times New Roman"/>
+          <w:kern w:val="0"/>
+          <w:szCs w:val="24"/>
+        </w:rPr>
+      </w:pPr>
+      <w:r>
+        <w:rPr>
+          <w:rFonts w:ascii="Times New Roman" w:eastAsia="標楷體" w:hAnsi="Times New Roman" w:cs="Times New Roman" w:hint="eastAsia"/>
+          <w:kern w:val="0"/>
+          <w:szCs w:val="24"/>
+        </w:rPr>
+        <w:t>從上面可以了解到，垃圾處理若是從解決</w:t>
+      </w:r>
+      <w:proofErr w:type="gramStart"/>
+      <w:r>
+        <w:rPr>
           <w:rFonts w:ascii="Times New Roman" w:eastAsia="標楷體" w:hAnsi="Times New Roman" w:cs="Times New Roman"/>
           <w:kern w:val="0"/>
           <w:szCs w:val="24"/>
@@ -228,49 +304,31 @@
           <w:kern w:val="0"/>
           <w:szCs w:val="24"/>
         </w:rPr>
-        <w:t>的處理方式，但回收也不適</w:t>
-      </w:r>
-      <w:proofErr w:type="gramStart"/>
-      <w:r>
-        <w:rPr>
-          <w:rFonts w:ascii="Times New Roman" w:eastAsia="標楷體" w:hAnsi="Times New Roman" w:cs="Times New Roman" w:hint="eastAsia"/>
-          <w:kern w:val="0"/>
-          <w:szCs w:val="24"/>
-        </w:rPr>
-        <w:t>萬能丹</w:t>
-      </w:r>
-      <w:proofErr w:type="gramEnd"/>
-      <w:r>
-        <w:rPr>
-          <w:rFonts w:ascii="Times New Roman" w:eastAsia="標楷體" w:hAnsi="Times New Roman" w:cs="Times New Roman" w:hint="eastAsia"/>
-          <w:kern w:val="0"/>
-          <w:szCs w:val="24"/>
-        </w:rPr>
-        <w:t>，不容忽視的是回收無法做到</w:t>
-      </w:r>
-      <w:r>
-        <w:rPr>
-          <w:rFonts w:ascii="Times New Roman" w:eastAsia="標楷體" w:hAnsi="Times New Roman" w:cs="Times New Roman" w:hint="eastAsia"/>
-          <w:kern w:val="0"/>
-          <w:szCs w:val="24"/>
-        </w:rPr>
-        <w:t>1</w:t>
-      </w:r>
-      <w:r>
-        <w:rPr>
-          <w:rFonts w:ascii="Times New Roman" w:eastAsia="標楷體" w:hAnsi="Times New Roman" w:cs="Times New Roman"/>
-          <w:kern w:val="0"/>
-          <w:szCs w:val="24"/>
-        </w:rPr>
-        <w:t>00%</w:t>
-      </w:r>
-      <w:r>
-        <w:rPr>
-          <w:rFonts w:ascii="Times New Roman" w:eastAsia="標楷體" w:hAnsi="Times New Roman" w:cs="Times New Roman" w:hint="eastAsia"/>
-          <w:kern w:val="0"/>
-          <w:szCs w:val="24"/>
-        </w:rPr>
-        <w:t>垃圾再利用處理，且回收過程中所需耗費的能源，更造成了額外經濟與環境成本支出。</w:t>
+        <w:t>已產生的垃圾</w:t>
+      </w:r>
+      <w:r>
+        <w:rPr>
+          <w:rFonts w:ascii="Times New Roman" w:eastAsia="標楷體" w:hAnsi="Times New Roman" w:cs="Times New Roman"/>
+          <w:kern w:val="0"/>
+          <w:szCs w:val="24"/>
+        </w:rPr>
+        <w:t>”</w:t>
+      </w:r>
+      <w:r>
+        <w:rPr>
+          <w:rFonts w:ascii="Times New Roman" w:eastAsia="標楷體" w:hAnsi="Times New Roman" w:cs="Times New Roman" w:hint="eastAsia"/>
+          <w:kern w:val="0"/>
+          <w:szCs w:val="24"/>
+        </w:rPr>
+        <w:t>角度處理，效果有限，因此換個角度，從減少垃圾產生方向處理，則可能會有意想不到的效果，因此從大型垃圾的源頭減量，在家具大型垃圾中部分仍然可以維修即可再利用，或甚至可以正常使用，但它們被拋棄的原因不外乎是</w:t>
+      </w:r>
+      <w:r>
+        <w:rPr>
+          <w:rFonts w:ascii="Times New Roman" w:eastAsia="標楷體" w:hAnsi="Times New Roman" w:cs="Times New Roman" w:hint="eastAsia"/>
+          <w:kern w:val="0"/>
+          <w:szCs w:val="24"/>
+        </w:rPr>
+        <w:t>屋內裝潢或家具擺放格局改變、搬家不易攜帶、短期使用、喜新厭舊的心態等等。</w:t>
       </w:r>
     </w:p>
     <w:p>
@@ -290,78 +348,6 @@
           <w:kern w:val="0"/>
           <w:szCs w:val="24"/>
         </w:rPr>
-        <w:t>從上面可以了解到，垃圾處理若是從解決</w:t>
-      </w:r>
-      <w:proofErr w:type="gramStart"/>
-      <w:r>
-        <w:rPr>
-          <w:rFonts w:ascii="Times New Roman" w:eastAsia="標楷體" w:hAnsi="Times New Roman" w:cs="Times New Roman"/>
-          <w:kern w:val="0"/>
-          <w:szCs w:val="24"/>
-        </w:rPr>
-        <w:t>”</w:t>
-      </w:r>
-      <w:proofErr w:type="gramEnd"/>
-      <w:r>
-        <w:rPr>
-          <w:rFonts w:ascii="Times New Roman" w:eastAsia="標楷體" w:hAnsi="Times New Roman" w:cs="Times New Roman" w:hint="eastAsia"/>
-          <w:kern w:val="0"/>
-          <w:szCs w:val="24"/>
-        </w:rPr>
-        <w:t>已產生的垃圾</w:t>
-      </w:r>
-      <w:proofErr w:type="gramStart"/>
-      <w:r>
-        <w:rPr>
-          <w:rFonts w:ascii="Times New Roman" w:eastAsia="標楷體" w:hAnsi="Times New Roman" w:cs="Times New Roman"/>
-          <w:kern w:val="0"/>
-          <w:szCs w:val="24"/>
-        </w:rPr>
-        <w:t>”</w:t>
-      </w:r>
-      <w:proofErr w:type="gramEnd"/>
-      <w:r>
-        <w:rPr>
-          <w:rFonts w:ascii="Times New Roman" w:eastAsia="標楷體" w:hAnsi="Times New Roman" w:cs="Times New Roman" w:hint="eastAsia"/>
-          <w:kern w:val="0"/>
-          <w:szCs w:val="24"/>
-        </w:rPr>
-        <w:t>角度處理，效果有限，因此換個角度</w:t>
-      </w:r>
-      <w:r>
-        <w:rPr>
-          <w:rFonts w:ascii="Times New Roman" w:eastAsia="標楷體" w:hAnsi="Times New Roman" w:cs="Times New Roman" w:hint="eastAsia"/>
-          <w:kern w:val="0"/>
-          <w:szCs w:val="24"/>
-        </w:rPr>
-        <w:t>，從減少垃圾產生方向處理，則可能會有意想不到的效果，因此從大型垃圾的源頭減量，在家具大型垃圾中部分仍然可以維修即可再利用，或甚至可以正常使用，但它們被拋棄的原因不外乎是</w:t>
-      </w:r>
-      <w:r>
-        <w:rPr>
-          <w:rFonts w:ascii="Times New Roman" w:eastAsia="標楷體" w:hAnsi="Times New Roman" w:cs="Times New Roman" w:hint="eastAsia"/>
-          <w:kern w:val="0"/>
-          <w:szCs w:val="24"/>
-        </w:rPr>
-        <w:t>屋內裝潢或家具擺放格局改變、搬家不易攜帶、短期使用、喜新厭舊的心態等等。</w:t>
-      </w:r>
-    </w:p>
-    <w:p>
-      <w:pPr>
-        <w:widowControl/>
-        <w:shd w:val="clear" w:color="auto" w:fill="FFFFFF"/>
-        <w:ind w:firstLine="480"/>
-        <w:rPr>
-          <w:rFonts w:ascii="Times New Roman" w:eastAsia="標楷體" w:hAnsi="Times New Roman" w:cs="Times New Roman" w:hint="eastAsia"/>
-          <w:kern w:val="0"/>
-          <w:szCs w:val="24"/>
-        </w:rPr>
-      </w:pPr>
-      <w:r>
-        <w:rPr>
-          <w:rFonts w:ascii="Times New Roman" w:eastAsia="標楷體" w:hAnsi="Times New Roman" w:cs="Times New Roman" w:hint="eastAsia"/>
-          <w:kern w:val="0"/>
-          <w:szCs w:val="24"/>
-        </w:rPr>
         <w:t>其實家具的使用年限並不短，妥善保存與使用下，家具可以使用很長的時間，</w:t>
       </w:r>
       <w:r>
@@ -370,15 +356,7 @@
           <w:kern w:val="0"/>
           <w:szCs w:val="24"/>
         </w:rPr>
-        <w:t>因此建立一個平台可供家具租賃選擇與租借，</w:t>
-      </w:r>
-      <w:r>
-        <w:rPr>
-          <w:rFonts w:ascii="Times New Roman" w:eastAsia="標楷體" w:hAnsi="Times New Roman" w:cs="Times New Roman" w:hint="eastAsia"/>
-          <w:kern w:val="0"/>
-          <w:szCs w:val="24"/>
-        </w:rPr>
-        <w:t>使家具重複循環使用，除了可以使家具大型垃圾減量，</w:t>
+        <w:t>因此建立一個平台可供家具租賃選擇與租借，使家具重複循環使用，除了可以使家具大型垃圾減量，</w:t>
       </w:r>
       <w:r>
         <w:rPr>
@@ -496,7 +474,7 @@
           <w:kern w:val="0"/>
           <w:szCs w:val="24"/>
         </w:rPr>
-        <w:t>來說不需要</w:t>
+        <w:t>來說不需</w:t>
       </w:r>
       <w:proofErr w:type="gramEnd"/>
       <w:r>
@@ -505,7 +483,7 @@
           <w:kern w:val="0"/>
           <w:szCs w:val="24"/>
         </w:rPr>
-        <w:t>花大錢即可改變屋內家具裝潢風格，使用各種不同家具；對於系統業者而言，僅須在採購家具與維修部分開銷即可收穫長期收租費用</w:t>
+        <w:t>要花大錢即可改變屋內家具裝潢風格，使用各種不同家具；對於系統業者而言，僅須在採購家具與維修部分開銷即可收穫長期收租費用</w:t>
       </w:r>
       <w:r>
         <w:rPr>
@@ -980,23 +958,7 @@
           <w:kern w:val="0"/>
           <w:szCs w:val="24"/>
         </w:rPr>
-        <w:t>家具租賃介面供</w:t>
-      </w:r>
-      <w:r>
-        <w:rPr>
-          <w:rFonts w:ascii="Times New Roman" w:eastAsia="標楷體" w:hAnsi="Times New Roman" w:cs="Times New Roman" w:hint="eastAsia"/>
-          <w:kern w:val="0"/>
-          <w:szCs w:val="24"/>
-        </w:rPr>
-        <w:t>使用者</w:t>
-      </w:r>
-      <w:r>
-        <w:rPr>
-          <w:rFonts w:ascii="Times New Roman" w:eastAsia="標楷體" w:hAnsi="Times New Roman" w:cs="Times New Roman" w:hint="eastAsia"/>
-          <w:kern w:val="0"/>
-          <w:szCs w:val="24"/>
-        </w:rPr>
-        <w:t>瀏覽不同家具項目，並附圖片與詳細說明</w:t>
+        <w:t>家具租賃介面供使用者瀏覽不同家具項目，並附圖片與詳細說明</w:t>
       </w:r>
     </w:p>
     <w:p>
@@ -1507,14 +1469,15 @@
         <w:widowControl/>
         <w:shd w:val="clear" w:color="auto" w:fill="FFFFFF"/>
         <w:rPr>
-          <w:rFonts w:ascii="Times New Roman" w:eastAsia="標楷體" w:hAnsi="Times New Roman" w:cs="Times New Roman" w:hint="eastAsia"/>
-          <w:kern w:val="0"/>
-          <w:szCs w:val="24"/>
-        </w:rPr>
-      </w:pPr>
-      <w:r>
-        <w:rPr>
-          <w:rFonts w:ascii="Times New Roman" w:eastAsia="標楷體" w:hAnsi="Times New Roman" w:cs="Times New Roman"/>
+          <w:rFonts w:ascii="Times New Roman" w:eastAsia="標楷體" w:hAnsi="Times New Roman" w:cs="Times New Roman"/>
+          <w:kern w:val="0"/>
+          <w:szCs w:val="24"/>
+        </w:rPr>
+      </w:pPr>
+      <w:r>
+        <w:rPr>
+          <w:rFonts w:ascii="Times New Roman" w:eastAsia="標楷體" w:hAnsi="Times New Roman" w:cs="Times New Roman"/>
+          <w:noProof/>
           <w:kern w:val="0"/>
           <w:szCs w:val="24"/>
         </w:rPr>
@@ -2617,12 +2580,1611 @@
       </w:pPr>
       <w:r>
         <w:rPr>
+          <w:rFonts w:ascii="Times New Roman" w:eastAsia="標楷體" w:hAnsi="Times New Roman" w:cs="Times New Roman" w:hint="eastAsia"/>
+          <w:kern w:val="0"/>
+          <w:szCs w:val="24"/>
+        </w:rPr>
+        <w:t>依照民法中租賃相關條文規定如下</w:t>
+      </w:r>
+      <w:r>
+        <w:rPr>
+          <w:rFonts w:ascii="Times New Roman" w:eastAsia="標楷體" w:hAnsi="Times New Roman" w:cs="Times New Roman" w:hint="eastAsia"/>
+          <w:kern w:val="0"/>
+          <w:szCs w:val="24"/>
+        </w:rPr>
+        <w:t>:</w:t>
+      </w:r>
+    </w:p>
+    <w:p>
+      <w:pPr>
+        <w:widowControl/>
+        <w:shd w:val="clear" w:color="auto" w:fill="FFFFFF"/>
+        <w:rPr>
+          <w:rFonts w:ascii="Times New Roman" w:eastAsia="標楷體" w:hAnsi="Times New Roman" w:cs="Times New Roman" w:hint="eastAsia"/>
+          <w:kern w:val="0"/>
+          <w:szCs w:val="24"/>
+        </w:rPr>
+      </w:pPr>
+      <w:r>
+        <w:rPr>
+          <w:rFonts w:ascii="Times New Roman" w:eastAsia="標楷體" w:hAnsi="Times New Roman" w:cs="Times New Roman" w:hint="eastAsia"/>
+          <w:kern w:val="0"/>
+          <w:szCs w:val="24"/>
+        </w:rPr>
+        <w:t>第</w:t>
+      </w:r>
+      <w:r>
+        <w:rPr>
+          <w:rFonts w:ascii="Times New Roman" w:eastAsia="標楷體" w:hAnsi="Times New Roman" w:cs="Times New Roman" w:hint="eastAsia"/>
+          <w:kern w:val="0"/>
+          <w:szCs w:val="24"/>
+        </w:rPr>
+        <w:t xml:space="preserve"> 429 </w:t>
+      </w:r>
+      <w:r>
+        <w:rPr>
+          <w:rFonts w:ascii="Times New Roman" w:eastAsia="標楷體" w:hAnsi="Times New Roman" w:cs="Times New Roman" w:hint="eastAsia"/>
+          <w:kern w:val="0"/>
+          <w:szCs w:val="24"/>
+        </w:rPr>
+        <w:t>條</w:t>
+      </w:r>
+    </w:p>
+    <w:p>
+      <w:pPr>
+        <w:widowControl/>
+        <w:shd w:val="clear" w:color="auto" w:fill="FFFFFF"/>
+        <w:rPr>
+          <w:rFonts w:ascii="Times New Roman" w:eastAsia="標楷體" w:hAnsi="Times New Roman" w:cs="Times New Roman" w:hint="eastAsia"/>
+          <w:kern w:val="0"/>
+          <w:szCs w:val="24"/>
+        </w:rPr>
+      </w:pPr>
+      <w:r>
+        <w:rPr>
+          <w:rFonts w:ascii="Times New Roman" w:eastAsia="標楷體" w:hAnsi="Times New Roman" w:cs="Times New Roman" w:hint="eastAsia"/>
+          <w:kern w:val="0"/>
+          <w:szCs w:val="24"/>
+        </w:rPr>
+        <w:t>租賃物之修繕，除契約另有訂定或另有習慣外，由出租人負擔。</w:t>
+      </w:r>
+    </w:p>
+    <w:p>
+      <w:pPr>
+        <w:widowControl/>
+        <w:shd w:val="clear" w:color="auto" w:fill="FFFFFF"/>
+        <w:rPr>
+          <w:rFonts w:ascii="Times New Roman" w:eastAsia="標楷體" w:hAnsi="Times New Roman" w:cs="Times New Roman" w:hint="eastAsia"/>
+          <w:kern w:val="0"/>
+          <w:szCs w:val="24"/>
+        </w:rPr>
+      </w:pPr>
+      <w:r>
+        <w:rPr>
+          <w:rFonts w:ascii="Times New Roman" w:eastAsia="標楷體" w:hAnsi="Times New Roman" w:cs="Times New Roman" w:hint="eastAsia"/>
+          <w:kern w:val="0"/>
+          <w:szCs w:val="24"/>
+        </w:rPr>
+        <w:t>出租人為保存租賃物所為之必要行為，承租人不得拒絕。</w:t>
+      </w:r>
+    </w:p>
+    <w:p>
+      <w:pPr>
+        <w:widowControl/>
+        <w:shd w:val="clear" w:color="auto" w:fill="FFFFFF"/>
+        <w:rPr>
+          <w:rFonts w:ascii="Times New Roman" w:eastAsia="標楷體" w:hAnsi="Times New Roman" w:cs="Times New Roman" w:hint="eastAsia"/>
+          <w:kern w:val="0"/>
+          <w:szCs w:val="24"/>
+        </w:rPr>
+      </w:pPr>
+      <w:r>
+        <w:rPr>
+          <w:rFonts w:ascii="Times New Roman" w:eastAsia="標楷體" w:hAnsi="Times New Roman" w:cs="Times New Roman" w:hint="eastAsia"/>
+          <w:kern w:val="0"/>
+          <w:szCs w:val="24"/>
+        </w:rPr>
+        <w:t>第</w:t>
+      </w:r>
+      <w:r>
+        <w:rPr>
+          <w:rFonts w:ascii="Times New Roman" w:eastAsia="標楷體" w:hAnsi="Times New Roman" w:cs="Times New Roman" w:hint="eastAsia"/>
+          <w:kern w:val="0"/>
+          <w:szCs w:val="24"/>
+        </w:rPr>
+        <w:t xml:space="preserve"> 430 </w:t>
+      </w:r>
+      <w:r>
+        <w:rPr>
+          <w:rFonts w:ascii="Times New Roman" w:eastAsia="標楷體" w:hAnsi="Times New Roman" w:cs="Times New Roman" w:hint="eastAsia"/>
+          <w:kern w:val="0"/>
+          <w:szCs w:val="24"/>
+        </w:rPr>
+        <w:t>條</w:t>
+      </w:r>
+    </w:p>
+    <w:p>
+      <w:pPr>
+        <w:widowControl/>
+        <w:shd w:val="clear" w:color="auto" w:fill="FFFFFF"/>
+        <w:rPr>
+          <w:rFonts w:ascii="Times New Roman" w:eastAsia="標楷體" w:hAnsi="Times New Roman" w:cs="Times New Roman" w:hint="eastAsia"/>
+          <w:kern w:val="0"/>
+          <w:szCs w:val="24"/>
+        </w:rPr>
+      </w:pPr>
+      <w:r>
+        <w:rPr>
+          <w:rFonts w:ascii="Times New Roman" w:eastAsia="標楷體" w:hAnsi="Times New Roman" w:cs="Times New Roman" w:hint="eastAsia"/>
+          <w:kern w:val="0"/>
+          <w:szCs w:val="24"/>
+        </w:rPr>
+        <w:t>租賃關係存續中，租賃物如有修繕之必要，應由出租人負擔者，承租人得定相當期限，催告出租人修繕，如出租人於其期限內不為修繕者，承租人得終止契約或自行修繕而請求出租人償還其費用或於租金中扣除之。</w:t>
+      </w:r>
+    </w:p>
+    <w:p>
+      <w:pPr>
+        <w:widowControl/>
+        <w:shd w:val="clear" w:color="auto" w:fill="FFFFFF"/>
+        <w:rPr>
+          <w:rFonts w:ascii="Times New Roman" w:eastAsia="標楷體" w:hAnsi="Times New Roman" w:cs="Times New Roman" w:hint="eastAsia"/>
+          <w:kern w:val="0"/>
+          <w:szCs w:val="24"/>
+        </w:rPr>
+      </w:pPr>
+      <w:r>
+        <w:rPr>
+          <w:rFonts w:ascii="Times New Roman" w:eastAsia="標楷體" w:hAnsi="Times New Roman" w:cs="Times New Roman" w:hint="eastAsia"/>
+          <w:kern w:val="0"/>
+          <w:szCs w:val="24"/>
+        </w:rPr>
+        <w:t>第</w:t>
+      </w:r>
+      <w:r>
+        <w:rPr>
+          <w:rFonts w:ascii="Times New Roman" w:eastAsia="標楷體" w:hAnsi="Times New Roman" w:cs="Times New Roman" w:hint="eastAsia"/>
+          <w:kern w:val="0"/>
+          <w:szCs w:val="24"/>
+        </w:rPr>
+        <w:t xml:space="preserve"> 431 </w:t>
+      </w:r>
+      <w:r>
+        <w:rPr>
+          <w:rFonts w:ascii="Times New Roman" w:eastAsia="標楷體" w:hAnsi="Times New Roman" w:cs="Times New Roman" w:hint="eastAsia"/>
+          <w:kern w:val="0"/>
+          <w:szCs w:val="24"/>
+        </w:rPr>
+        <w:t>條</w:t>
+      </w:r>
+    </w:p>
+    <w:p>
+      <w:pPr>
+        <w:widowControl/>
+        <w:shd w:val="clear" w:color="auto" w:fill="FFFFFF"/>
+        <w:rPr>
+          <w:rFonts w:ascii="Times New Roman" w:eastAsia="標楷體" w:hAnsi="Times New Roman" w:cs="Times New Roman" w:hint="eastAsia"/>
+          <w:kern w:val="0"/>
+          <w:szCs w:val="24"/>
+        </w:rPr>
+      </w:pPr>
+      <w:r>
+        <w:rPr>
+          <w:rFonts w:ascii="Times New Roman" w:eastAsia="標楷體" w:hAnsi="Times New Roman" w:cs="Times New Roman" w:hint="eastAsia"/>
+          <w:kern w:val="0"/>
+          <w:szCs w:val="24"/>
+        </w:rPr>
+        <w:t>承租人就租賃物支出有益費用，因而增加該物之價值者，如出租人知其情事而不為反對之表示，於租賃關係終止時，應償還其費用。但以其現存之增價額為限。</w:t>
+      </w:r>
+    </w:p>
+    <w:p>
+      <w:pPr>
+        <w:widowControl/>
+        <w:shd w:val="clear" w:color="auto" w:fill="FFFFFF"/>
+        <w:rPr>
+          <w:rFonts w:ascii="Times New Roman" w:eastAsia="標楷體" w:hAnsi="Times New Roman" w:cs="Times New Roman" w:hint="eastAsia"/>
+          <w:kern w:val="0"/>
+          <w:szCs w:val="24"/>
+        </w:rPr>
+      </w:pPr>
+      <w:r>
+        <w:rPr>
+          <w:rFonts w:ascii="Times New Roman" w:eastAsia="標楷體" w:hAnsi="Times New Roman" w:cs="Times New Roman" w:hint="eastAsia"/>
+          <w:kern w:val="0"/>
+          <w:szCs w:val="24"/>
+        </w:rPr>
+        <w:t>承租人就租賃物所增設之工作物，得取回之。但應回復租賃物之原狀。</w:t>
+      </w:r>
+    </w:p>
+    <w:p>
+      <w:pPr>
+        <w:widowControl/>
+        <w:shd w:val="clear" w:color="auto" w:fill="FFFFFF"/>
+        <w:rPr>
+          <w:rFonts w:ascii="Times New Roman" w:eastAsia="標楷體" w:hAnsi="Times New Roman" w:cs="Times New Roman" w:hint="eastAsia"/>
+          <w:kern w:val="0"/>
+          <w:szCs w:val="24"/>
+        </w:rPr>
+      </w:pPr>
+      <w:r>
+        <w:rPr>
+          <w:rFonts w:ascii="Times New Roman" w:eastAsia="標楷體" w:hAnsi="Times New Roman" w:cs="Times New Roman" w:hint="eastAsia"/>
+          <w:kern w:val="0"/>
+          <w:szCs w:val="24"/>
+        </w:rPr>
+        <w:t>第</w:t>
+      </w:r>
+      <w:r>
+        <w:rPr>
+          <w:rFonts w:ascii="Times New Roman" w:eastAsia="標楷體" w:hAnsi="Times New Roman" w:cs="Times New Roman" w:hint="eastAsia"/>
+          <w:kern w:val="0"/>
+          <w:szCs w:val="24"/>
+        </w:rPr>
+        <w:t xml:space="preserve"> 432 </w:t>
+      </w:r>
+      <w:r>
+        <w:rPr>
+          <w:rFonts w:ascii="Times New Roman" w:eastAsia="標楷體" w:hAnsi="Times New Roman" w:cs="Times New Roman" w:hint="eastAsia"/>
+          <w:kern w:val="0"/>
+          <w:szCs w:val="24"/>
+        </w:rPr>
+        <w:t>條</w:t>
+      </w:r>
+    </w:p>
+    <w:p>
+      <w:pPr>
+        <w:widowControl/>
+        <w:shd w:val="clear" w:color="auto" w:fill="FFFFFF"/>
+        <w:rPr>
+          <w:rFonts w:ascii="Times New Roman" w:eastAsia="標楷體" w:hAnsi="Times New Roman" w:cs="Times New Roman" w:hint="eastAsia"/>
+          <w:kern w:val="0"/>
+          <w:szCs w:val="24"/>
+        </w:rPr>
+      </w:pPr>
+      <w:r>
+        <w:rPr>
+          <w:rFonts w:ascii="Times New Roman" w:eastAsia="標楷體" w:hAnsi="Times New Roman" w:cs="Times New Roman" w:hint="eastAsia"/>
+          <w:kern w:val="0"/>
+          <w:szCs w:val="24"/>
+        </w:rPr>
+        <w:t>承租人應以善良管理人之注意，保管租賃物，租賃物有生產力者，並應保持其生產力。</w:t>
+      </w:r>
+    </w:p>
+    <w:p>
+      <w:pPr>
+        <w:widowControl/>
+        <w:shd w:val="clear" w:color="auto" w:fill="FFFFFF"/>
+        <w:rPr>
+          <w:rFonts w:ascii="Times New Roman" w:eastAsia="標楷體" w:hAnsi="Times New Roman" w:cs="Times New Roman" w:hint="eastAsia"/>
+          <w:kern w:val="0"/>
+          <w:szCs w:val="24"/>
+        </w:rPr>
+      </w:pPr>
+      <w:r>
+        <w:rPr>
+          <w:rFonts w:ascii="Times New Roman" w:eastAsia="標楷體" w:hAnsi="Times New Roman" w:cs="Times New Roman" w:hint="eastAsia"/>
+          <w:kern w:val="0"/>
+          <w:szCs w:val="24"/>
+        </w:rPr>
+        <w:t>承租人違反前項義務，致租賃物毀損、</w:t>
+      </w:r>
+      <w:proofErr w:type="gramStart"/>
+      <w:r>
+        <w:rPr>
+          <w:rFonts w:ascii="Times New Roman" w:eastAsia="標楷體" w:hAnsi="Times New Roman" w:cs="Times New Roman" w:hint="eastAsia"/>
+          <w:kern w:val="0"/>
+          <w:szCs w:val="24"/>
+        </w:rPr>
+        <w:t>滅失者</w:t>
+      </w:r>
+      <w:proofErr w:type="gramEnd"/>
+      <w:r>
+        <w:rPr>
+          <w:rFonts w:ascii="Times New Roman" w:eastAsia="標楷體" w:hAnsi="Times New Roman" w:cs="Times New Roman" w:hint="eastAsia"/>
+          <w:kern w:val="0"/>
+          <w:szCs w:val="24"/>
+        </w:rPr>
+        <w:t>，負損害賠償責任。但依約定之方法</w:t>
+      </w:r>
+      <w:proofErr w:type="gramStart"/>
+      <w:r>
+        <w:rPr>
+          <w:rFonts w:ascii="Times New Roman" w:eastAsia="標楷體" w:hAnsi="Times New Roman" w:cs="Times New Roman" w:hint="eastAsia"/>
+          <w:kern w:val="0"/>
+          <w:szCs w:val="24"/>
+        </w:rPr>
+        <w:t>或依物之</w:t>
+      </w:r>
+      <w:proofErr w:type="gramEnd"/>
+      <w:r>
+        <w:rPr>
+          <w:rFonts w:ascii="Times New Roman" w:eastAsia="標楷體" w:hAnsi="Times New Roman" w:cs="Times New Roman" w:hint="eastAsia"/>
+          <w:kern w:val="0"/>
+          <w:szCs w:val="24"/>
+        </w:rPr>
+        <w:t>性質而定之方法為使用、收益，致有變更或毀損者，不在此限。</w:t>
+      </w:r>
+    </w:p>
+    <w:p>
+      <w:pPr>
+        <w:widowControl/>
+        <w:shd w:val="clear" w:color="auto" w:fill="FFFFFF"/>
+        <w:rPr>
+          <w:rFonts w:ascii="Times New Roman" w:eastAsia="標楷體" w:hAnsi="Times New Roman" w:cs="Times New Roman" w:hint="eastAsia"/>
+          <w:kern w:val="0"/>
+          <w:szCs w:val="24"/>
+        </w:rPr>
+      </w:pPr>
+      <w:r>
+        <w:rPr>
+          <w:rFonts w:ascii="Times New Roman" w:eastAsia="標楷體" w:hAnsi="Times New Roman" w:cs="Times New Roman" w:hint="eastAsia"/>
+          <w:kern w:val="0"/>
+          <w:szCs w:val="24"/>
+        </w:rPr>
+        <w:lastRenderedPageBreak/>
+        <w:t>第</w:t>
+      </w:r>
+      <w:r>
+        <w:rPr>
+          <w:rFonts w:ascii="Times New Roman" w:eastAsia="標楷體" w:hAnsi="Times New Roman" w:cs="Times New Roman" w:hint="eastAsia"/>
+          <w:kern w:val="0"/>
+          <w:szCs w:val="24"/>
+        </w:rPr>
+        <w:t xml:space="preserve"> 433 </w:t>
+      </w:r>
+      <w:r>
+        <w:rPr>
+          <w:rFonts w:ascii="Times New Roman" w:eastAsia="標楷體" w:hAnsi="Times New Roman" w:cs="Times New Roman" w:hint="eastAsia"/>
+          <w:kern w:val="0"/>
+          <w:szCs w:val="24"/>
+        </w:rPr>
+        <w:t>條</w:t>
+      </w:r>
+    </w:p>
+    <w:p>
+      <w:pPr>
+        <w:widowControl/>
+        <w:shd w:val="clear" w:color="auto" w:fill="FFFFFF"/>
+        <w:rPr>
+          <w:rFonts w:ascii="Times New Roman" w:eastAsia="標楷體" w:hAnsi="Times New Roman" w:cs="Times New Roman" w:hint="eastAsia"/>
+          <w:kern w:val="0"/>
+          <w:szCs w:val="24"/>
+        </w:rPr>
+      </w:pPr>
+      <w:r>
+        <w:rPr>
+          <w:rFonts w:ascii="Times New Roman" w:eastAsia="標楷體" w:hAnsi="Times New Roman" w:cs="Times New Roman" w:hint="eastAsia"/>
+          <w:kern w:val="0"/>
+          <w:szCs w:val="24"/>
+        </w:rPr>
+        <w:t>因承租人之同居人或因承租人允許為租賃物之使用、收益之第三人應負責之事由，致租賃物毀損、</w:t>
+      </w:r>
+      <w:proofErr w:type="gramStart"/>
+      <w:r>
+        <w:rPr>
+          <w:rFonts w:ascii="Times New Roman" w:eastAsia="標楷體" w:hAnsi="Times New Roman" w:cs="Times New Roman" w:hint="eastAsia"/>
+          <w:kern w:val="0"/>
+          <w:szCs w:val="24"/>
+        </w:rPr>
+        <w:t>滅失者</w:t>
+      </w:r>
+      <w:proofErr w:type="gramEnd"/>
+      <w:r>
+        <w:rPr>
+          <w:rFonts w:ascii="Times New Roman" w:eastAsia="標楷體" w:hAnsi="Times New Roman" w:cs="Times New Roman" w:hint="eastAsia"/>
+          <w:kern w:val="0"/>
+          <w:szCs w:val="24"/>
+        </w:rPr>
+        <w:t>，承租人負損害賠償責任。</w:t>
+      </w:r>
+    </w:p>
+    <w:p>
+      <w:pPr>
+        <w:widowControl/>
+        <w:shd w:val="clear" w:color="auto" w:fill="FFFFFF"/>
+        <w:rPr>
+          <w:rFonts w:ascii="Times New Roman" w:eastAsia="標楷體" w:hAnsi="Times New Roman" w:cs="Times New Roman" w:hint="eastAsia"/>
+          <w:kern w:val="0"/>
+          <w:szCs w:val="24"/>
+        </w:rPr>
+      </w:pPr>
+      <w:r>
+        <w:rPr>
+          <w:rFonts w:ascii="Times New Roman" w:eastAsia="標楷體" w:hAnsi="Times New Roman" w:cs="Times New Roman" w:hint="eastAsia"/>
+          <w:kern w:val="0"/>
+          <w:szCs w:val="24"/>
+        </w:rPr>
+        <w:t>第</w:t>
+      </w:r>
+      <w:r>
+        <w:rPr>
+          <w:rFonts w:ascii="Times New Roman" w:eastAsia="標楷體" w:hAnsi="Times New Roman" w:cs="Times New Roman" w:hint="eastAsia"/>
+          <w:kern w:val="0"/>
+          <w:szCs w:val="24"/>
+        </w:rPr>
+        <w:t xml:space="preserve"> 434 </w:t>
+      </w:r>
+      <w:r>
+        <w:rPr>
+          <w:rFonts w:ascii="Times New Roman" w:eastAsia="標楷體" w:hAnsi="Times New Roman" w:cs="Times New Roman" w:hint="eastAsia"/>
+          <w:kern w:val="0"/>
+          <w:szCs w:val="24"/>
+        </w:rPr>
+        <w:t>條</w:t>
+      </w:r>
+    </w:p>
+    <w:p>
+      <w:pPr>
+        <w:widowControl/>
+        <w:shd w:val="clear" w:color="auto" w:fill="FFFFFF"/>
+        <w:rPr>
+          <w:rFonts w:ascii="Times New Roman" w:eastAsia="標楷體" w:hAnsi="Times New Roman" w:cs="Times New Roman" w:hint="eastAsia"/>
+          <w:kern w:val="0"/>
+          <w:szCs w:val="24"/>
+        </w:rPr>
+      </w:pPr>
+      <w:r>
+        <w:rPr>
+          <w:rFonts w:ascii="Times New Roman" w:eastAsia="標楷體" w:hAnsi="Times New Roman" w:cs="Times New Roman" w:hint="eastAsia"/>
+          <w:kern w:val="0"/>
+          <w:szCs w:val="24"/>
+        </w:rPr>
+        <w:t>租賃物因承租人之重大過失，致失火而毀損、</w:t>
+      </w:r>
+      <w:proofErr w:type="gramStart"/>
+      <w:r>
+        <w:rPr>
+          <w:rFonts w:ascii="Times New Roman" w:eastAsia="標楷體" w:hAnsi="Times New Roman" w:cs="Times New Roman" w:hint="eastAsia"/>
+          <w:kern w:val="0"/>
+          <w:szCs w:val="24"/>
+        </w:rPr>
+        <w:t>滅失者</w:t>
+      </w:r>
+      <w:proofErr w:type="gramEnd"/>
+      <w:r>
+        <w:rPr>
+          <w:rFonts w:ascii="Times New Roman" w:eastAsia="標楷體" w:hAnsi="Times New Roman" w:cs="Times New Roman" w:hint="eastAsia"/>
+          <w:kern w:val="0"/>
+          <w:szCs w:val="24"/>
+        </w:rPr>
+        <w:t>，承租人對於出租人負損害賠償責任。</w:t>
+      </w:r>
+    </w:p>
+    <w:p>
+      <w:pPr>
+        <w:widowControl/>
+        <w:shd w:val="clear" w:color="auto" w:fill="FFFFFF"/>
+        <w:rPr>
+          <w:rFonts w:ascii="Times New Roman" w:eastAsia="標楷體" w:hAnsi="Times New Roman" w:cs="Times New Roman" w:hint="eastAsia"/>
+          <w:kern w:val="0"/>
+          <w:szCs w:val="24"/>
+        </w:rPr>
+      </w:pPr>
+      <w:r>
+        <w:rPr>
+          <w:rFonts w:ascii="Times New Roman" w:eastAsia="標楷體" w:hAnsi="Times New Roman" w:cs="Times New Roman" w:hint="eastAsia"/>
+          <w:kern w:val="0"/>
+          <w:szCs w:val="24"/>
+        </w:rPr>
+        <w:t>第</w:t>
+      </w:r>
+      <w:r>
+        <w:rPr>
+          <w:rFonts w:ascii="Times New Roman" w:eastAsia="標楷體" w:hAnsi="Times New Roman" w:cs="Times New Roman" w:hint="eastAsia"/>
+          <w:kern w:val="0"/>
+          <w:szCs w:val="24"/>
+        </w:rPr>
+        <w:t xml:space="preserve"> 435 </w:t>
+      </w:r>
+      <w:r>
+        <w:rPr>
+          <w:rFonts w:ascii="Times New Roman" w:eastAsia="標楷體" w:hAnsi="Times New Roman" w:cs="Times New Roman" w:hint="eastAsia"/>
+          <w:kern w:val="0"/>
+          <w:szCs w:val="24"/>
+        </w:rPr>
+        <w:t>條</w:t>
+      </w:r>
+    </w:p>
+    <w:p>
+      <w:pPr>
+        <w:widowControl/>
+        <w:shd w:val="clear" w:color="auto" w:fill="FFFFFF"/>
+        <w:rPr>
+          <w:rFonts w:ascii="Times New Roman" w:eastAsia="標楷體" w:hAnsi="Times New Roman" w:cs="Times New Roman" w:hint="eastAsia"/>
+          <w:kern w:val="0"/>
+          <w:szCs w:val="24"/>
+        </w:rPr>
+      </w:pPr>
+      <w:r>
+        <w:rPr>
+          <w:rFonts w:ascii="Times New Roman" w:eastAsia="標楷體" w:hAnsi="Times New Roman" w:cs="Times New Roman" w:hint="eastAsia"/>
+          <w:kern w:val="0"/>
+          <w:szCs w:val="24"/>
+        </w:rPr>
+        <w:t>租賃關係存續中，因不可歸責於承租人之事由，致租賃物之</w:t>
+      </w:r>
+      <w:proofErr w:type="gramStart"/>
+      <w:r>
+        <w:rPr>
+          <w:rFonts w:ascii="Times New Roman" w:eastAsia="標楷體" w:hAnsi="Times New Roman" w:cs="Times New Roman" w:hint="eastAsia"/>
+          <w:kern w:val="0"/>
+          <w:szCs w:val="24"/>
+        </w:rPr>
+        <w:t>一部滅失者</w:t>
+      </w:r>
+      <w:proofErr w:type="gramEnd"/>
+      <w:r>
+        <w:rPr>
+          <w:rFonts w:ascii="Times New Roman" w:eastAsia="標楷體" w:hAnsi="Times New Roman" w:cs="Times New Roman" w:hint="eastAsia"/>
+          <w:kern w:val="0"/>
+          <w:szCs w:val="24"/>
+        </w:rPr>
+        <w:t>，承租人</w:t>
+      </w:r>
+      <w:proofErr w:type="gramStart"/>
+      <w:r>
+        <w:rPr>
+          <w:rFonts w:ascii="Times New Roman" w:eastAsia="標楷體" w:hAnsi="Times New Roman" w:cs="Times New Roman" w:hint="eastAsia"/>
+          <w:kern w:val="0"/>
+          <w:szCs w:val="24"/>
+        </w:rPr>
+        <w:t>得按滅失</w:t>
+      </w:r>
+      <w:proofErr w:type="gramEnd"/>
+      <w:r>
+        <w:rPr>
+          <w:rFonts w:ascii="Times New Roman" w:eastAsia="標楷體" w:hAnsi="Times New Roman" w:cs="Times New Roman" w:hint="eastAsia"/>
+          <w:kern w:val="0"/>
+          <w:szCs w:val="24"/>
+        </w:rPr>
+        <w:t>之部分，請求減少租金。</w:t>
+      </w:r>
+    </w:p>
+    <w:p>
+      <w:pPr>
+        <w:widowControl/>
+        <w:shd w:val="clear" w:color="auto" w:fill="FFFFFF"/>
+        <w:rPr>
+          <w:rFonts w:ascii="Times New Roman" w:eastAsia="標楷體" w:hAnsi="Times New Roman" w:cs="Times New Roman" w:hint="eastAsia"/>
+          <w:kern w:val="0"/>
+          <w:szCs w:val="24"/>
+        </w:rPr>
+      </w:pPr>
+      <w:r>
+        <w:rPr>
+          <w:rFonts w:ascii="Times New Roman" w:eastAsia="標楷體" w:hAnsi="Times New Roman" w:cs="Times New Roman" w:hint="eastAsia"/>
+          <w:kern w:val="0"/>
+          <w:szCs w:val="24"/>
+        </w:rPr>
+        <w:t>前項情形，承租人就其存餘部分不能達租賃之目的者，得終止契約。</w:t>
+      </w:r>
+    </w:p>
+    <w:p>
+      <w:pPr>
+        <w:widowControl/>
+        <w:shd w:val="clear" w:color="auto" w:fill="FFFFFF"/>
+        <w:rPr>
+          <w:rFonts w:ascii="Times New Roman" w:eastAsia="標楷體" w:hAnsi="Times New Roman" w:cs="Times New Roman" w:hint="eastAsia"/>
+          <w:kern w:val="0"/>
+          <w:szCs w:val="24"/>
+        </w:rPr>
+      </w:pPr>
+      <w:r>
+        <w:rPr>
+          <w:rFonts w:ascii="Times New Roman" w:eastAsia="標楷體" w:hAnsi="Times New Roman" w:cs="Times New Roman" w:hint="eastAsia"/>
+          <w:kern w:val="0"/>
+          <w:szCs w:val="24"/>
+        </w:rPr>
+        <w:t>第</w:t>
+      </w:r>
+      <w:r>
+        <w:rPr>
+          <w:rFonts w:ascii="Times New Roman" w:eastAsia="標楷體" w:hAnsi="Times New Roman" w:cs="Times New Roman" w:hint="eastAsia"/>
+          <w:kern w:val="0"/>
+          <w:szCs w:val="24"/>
+        </w:rPr>
+        <w:t xml:space="preserve"> 436 </w:t>
+      </w:r>
+      <w:r>
+        <w:rPr>
+          <w:rFonts w:ascii="Times New Roman" w:eastAsia="標楷體" w:hAnsi="Times New Roman" w:cs="Times New Roman" w:hint="eastAsia"/>
+          <w:kern w:val="0"/>
+          <w:szCs w:val="24"/>
+        </w:rPr>
+        <w:t>條</w:t>
+      </w:r>
+    </w:p>
+    <w:p>
+      <w:pPr>
+        <w:widowControl/>
+        <w:shd w:val="clear" w:color="auto" w:fill="FFFFFF"/>
+        <w:rPr>
+          <w:rFonts w:ascii="Times New Roman" w:eastAsia="標楷體" w:hAnsi="Times New Roman" w:cs="Times New Roman" w:hint="eastAsia"/>
+          <w:kern w:val="0"/>
+          <w:szCs w:val="24"/>
+        </w:rPr>
+      </w:pPr>
+      <w:r>
+        <w:rPr>
+          <w:rFonts w:ascii="Times New Roman" w:eastAsia="標楷體" w:hAnsi="Times New Roman" w:cs="Times New Roman" w:hint="eastAsia"/>
+          <w:kern w:val="0"/>
+          <w:szCs w:val="24"/>
+        </w:rPr>
+        <w:t>前條規定，於承租人因第三人就租賃物主張權利，致不能為約定之使用、收益者</w:t>
+      </w:r>
+      <w:proofErr w:type="gramStart"/>
+      <w:r>
+        <w:rPr>
+          <w:rFonts w:ascii="Times New Roman" w:eastAsia="標楷體" w:hAnsi="Times New Roman" w:cs="Times New Roman" w:hint="eastAsia"/>
+          <w:kern w:val="0"/>
+          <w:szCs w:val="24"/>
+        </w:rPr>
+        <w:t>準</w:t>
+      </w:r>
+      <w:proofErr w:type="gramEnd"/>
+      <w:r>
+        <w:rPr>
+          <w:rFonts w:ascii="Times New Roman" w:eastAsia="標楷體" w:hAnsi="Times New Roman" w:cs="Times New Roman" w:hint="eastAsia"/>
+          <w:kern w:val="0"/>
+          <w:szCs w:val="24"/>
+        </w:rPr>
+        <w:t>用之。</w:t>
+      </w:r>
+    </w:p>
+    <w:p>
+      <w:pPr>
+        <w:widowControl/>
+        <w:shd w:val="clear" w:color="auto" w:fill="FFFFFF"/>
+        <w:rPr>
+          <w:rFonts w:ascii="Times New Roman" w:eastAsia="標楷體" w:hAnsi="Times New Roman" w:cs="Times New Roman" w:hint="eastAsia"/>
+          <w:kern w:val="0"/>
+          <w:szCs w:val="24"/>
+        </w:rPr>
+      </w:pPr>
+      <w:r>
+        <w:rPr>
+          <w:rFonts w:ascii="Times New Roman" w:eastAsia="標楷體" w:hAnsi="Times New Roman" w:cs="Times New Roman" w:hint="eastAsia"/>
+          <w:kern w:val="0"/>
+          <w:szCs w:val="24"/>
+        </w:rPr>
+        <w:t>第</w:t>
+      </w:r>
+      <w:r>
+        <w:rPr>
+          <w:rFonts w:ascii="Times New Roman" w:eastAsia="標楷體" w:hAnsi="Times New Roman" w:cs="Times New Roman" w:hint="eastAsia"/>
+          <w:kern w:val="0"/>
+          <w:szCs w:val="24"/>
+        </w:rPr>
+        <w:t xml:space="preserve"> 437 </w:t>
+      </w:r>
+      <w:r>
+        <w:rPr>
+          <w:rFonts w:ascii="Times New Roman" w:eastAsia="標楷體" w:hAnsi="Times New Roman" w:cs="Times New Roman" w:hint="eastAsia"/>
+          <w:kern w:val="0"/>
+          <w:szCs w:val="24"/>
+        </w:rPr>
+        <w:t>條</w:t>
+      </w:r>
+    </w:p>
+    <w:p>
+      <w:pPr>
+        <w:widowControl/>
+        <w:shd w:val="clear" w:color="auto" w:fill="FFFFFF"/>
+        <w:rPr>
+          <w:rFonts w:ascii="Times New Roman" w:eastAsia="標楷體" w:hAnsi="Times New Roman" w:cs="Times New Roman" w:hint="eastAsia"/>
+          <w:kern w:val="0"/>
+          <w:szCs w:val="24"/>
+        </w:rPr>
+      </w:pPr>
+      <w:r>
+        <w:rPr>
+          <w:rFonts w:ascii="Times New Roman" w:eastAsia="標楷體" w:hAnsi="Times New Roman" w:cs="Times New Roman" w:hint="eastAsia"/>
+          <w:kern w:val="0"/>
+          <w:szCs w:val="24"/>
+        </w:rPr>
+        <w:t>租賃關係存續中，租賃物如有修繕之必要，應由出租人負擔者，或因防止危害有設備之必要，或第三人就租賃物主張權利者，承租人應即通知出租人。但為出租人所已知者，不在此限。</w:t>
+      </w:r>
+    </w:p>
+    <w:p>
+      <w:pPr>
+        <w:widowControl/>
+        <w:shd w:val="clear" w:color="auto" w:fill="FFFFFF"/>
+        <w:rPr>
+          <w:rFonts w:ascii="Times New Roman" w:eastAsia="標楷體" w:hAnsi="Times New Roman" w:cs="Times New Roman" w:hint="eastAsia"/>
+          <w:kern w:val="0"/>
+          <w:szCs w:val="24"/>
+        </w:rPr>
+      </w:pPr>
+      <w:r>
+        <w:rPr>
+          <w:rFonts w:ascii="Times New Roman" w:eastAsia="標楷體" w:hAnsi="Times New Roman" w:cs="Times New Roman" w:hint="eastAsia"/>
+          <w:kern w:val="0"/>
+          <w:szCs w:val="24"/>
+        </w:rPr>
+        <w:t>承租人</w:t>
+      </w:r>
+      <w:proofErr w:type="gramStart"/>
+      <w:r>
+        <w:rPr>
+          <w:rFonts w:ascii="Times New Roman" w:eastAsia="標楷體" w:hAnsi="Times New Roman" w:cs="Times New Roman" w:hint="eastAsia"/>
+          <w:kern w:val="0"/>
+          <w:szCs w:val="24"/>
+        </w:rPr>
+        <w:t>怠</w:t>
+      </w:r>
+      <w:proofErr w:type="gramEnd"/>
+      <w:r>
+        <w:rPr>
+          <w:rFonts w:ascii="Times New Roman" w:eastAsia="標楷體" w:hAnsi="Times New Roman" w:cs="Times New Roman" w:hint="eastAsia"/>
+          <w:kern w:val="0"/>
+          <w:szCs w:val="24"/>
+        </w:rPr>
+        <w:t>於為前項通知，致出租人不能及時救濟者，應賠償出租人因此所生之損害。</w:t>
+      </w:r>
+    </w:p>
+    <w:p>
+      <w:pPr>
+        <w:widowControl/>
+        <w:shd w:val="clear" w:color="auto" w:fill="FFFFFF"/>
+        <w:rPr>
+          <w:rFonts w:ascii="Times New Roman" w:eastAsia="標楷體" w:hAnsi="Times New Roman" w:cs="Times New Roman" w:hint="eastAsia"/>
+          <w:kern w:val="0"/>
+          <w:szCs w:val="24"/>
+        </w:rPr>
+      </w:pPr>
+      <w:r>
+        <w:rPr>
+          <w:rFonts w:ascii="Times New Roman" w:eastAsia="標楷體" w:hAnsi="Times New Roman" w:cs="Times New Roman" w:hint="eastAsia"/>
+          <w:kern w:val="0"/>
+          <w:szCs w:val="24"/>
+        </w:rPr>
+        <w:t>第</w:t>
+      </w:r>
+      <w:r>
+        <w:rPr>
+          <w:rFonts w:ascii="Times New Roman" w:eastAsia="標楷體" w:hAnsi="Times New Roman" w:cs="Times New Roman" w:hint="eastAsia"/>
+          <w:kern w:val="0"/>
+          <w:szCs w:val="24"/>
+        </w:rPr>
+        <w:t xml:space="preserve"> 438 </w:t>
+      </w:r>
+      <w:r>
+        <w:rPr>
+          <w:rFonts w:ascii="Times New Roman" w:eastAsia="標楷體" w:hAnsi="Times New Roman" w:cs="Times New Roman" w:hint="eastAsia"/>
+          <w:kern w:val="0"/>
+          <w:szCs w:val="24"/>
+        </w:rPr>
+        <w:t>條</w:t>
+      </w:r>
+    </w:p>
+    <w:p>
+      <w:pPr>
+        <w:widowControl/>
+        <w:shd w:val="clear" w:color="auto" w:fill="FFFFFF"/>
+        <w:rPr>
+          <w:rFonts w:ascii="Times New Roman" w:eastAsia="標楷體" w:hAnsi="Times New Roman" w:cs="Times New Roman" w:hint="eastAsia"/>
+          <w:kern w:val="0"/>
+          <w:szCs w:val="24"/>
+        </w:rPr>
+      </w:pPr>
+      <w:r>
+        <w:rPr>
+          <w:rFonts w:ascii="Times New Roman" w:eastAsia="標楷體" w:hAnsi="Times New Roman" w:cs="Times New Roman" w:hint="eastAsia"/>
+          <w:kern w:val="0"/>
+          <w:szCs w:val="24"/>
+        </w:rPr>
+        <w:t>承租人應依約定方法，為租賃物之使用、收益；無約定方法者，應以依租賃物之性質而定之方法為之。</w:t>
+      </w:r>
+    </w:p>
+    <w:p>
+      <w:pPr>
+        <w:widowControl/>
+        <w:shd w:val="clear" w:color="auto" w:fill="FFFFFF"/>
+        <w:rPr>
+          <w:rFonts w:ascii="Times New Roman" w:eastAsia="標楷體" w:hAnsi="Times New Roman" w:cs="Times New Roman" w:hint="eastAsia"/>
+          <w:kern w:val="0"/>
+          <w:szCs w:val="24"/>
+        </w:rPr>
+      </w:pPr>
+      <w:r>
+        <w:rPr>
+          <w:rFonts w:ascii="Times New Roman" w:eastAsia="標楷體" w:hAnsi="Times New Roman" w:cs="Times New Roman" w:hint="eastAsia"/>
+          <w:kern w:val="0"/>
+          <w:szCs w:val="24"/>
+        </w:rPr>
+        <w:t>承租人違反前項之規定為租賃物之使用、收益，經出租人阻止而仍繼續為之者，出租人得終止契約。</w:t>
+      </w:r>
+    </w:p>
+    <w:p>
+      <w:pPr>
+        <w:widowControl/>
+        <w:shd w:val="clear" w:color="auto" w:fill="FFFFFF"/>
+        <w:rPr>
+          <w:rFonts w:ascii="Times New Roman" w:eastAsia="標楷體" w:hAnsi="Times New Roman" w:cs="Times New Roman" w:hint="eastAsia"/>
+          <w:kern w:val="0"/>
+          <w:szCs w:val="24"/>
+        </w:rPr>
+      </w:pPr>
+      <w:r>
+        <w:rPr>
+          <w:rFonts w:ascii="Times New Roman" w:eastAsia="標楷體" w:hAnsi="Times New Roman" w:cs="Times New Roman" w:hint="eastAsia"/>
+          <w:kern w:val="0"/>
+          <w:szCs w:val="24"/>
+        </w:rPr>
+        <w:t>第</w:t>
+      </w:r>
+      <w:r>
+        <w:rPr>
+          <w:rFonts w:ascii="Times New Roman" w:eastAsia="標楷體" w:hAnsi="Times New Roman" w:cs="Times New Roman" w:hint="eastAsia"/>
+          <w:kern w:val="0"/>
+          <w:szCs w:val="24"/>
+        </w:rPr>
+        <w:t xml:space="preserve"> 439 </w:t>
+      </w:r>
+      <w:r>
+        <w:rPr>
+          <w:rFonts w:ascii="Times New Roman" w:eastAsia="標楷體" w:hAnsi="Times New Roman" w:cs="Times New Roman" w:hint="eastAsia"/>
+          <w:kern w:val="0"/>
+          <w:szCs w:val="24"/>
+        </w:rPr>
+        <w:t>條</w:t>
+      </w:r>
+    </w:p>
+    <w:p>
+      <w:pPr>
+        <w:widowControl/>
+        <w:shd w:val="clear" w:color="auto" w:fill="FFFFFF"/>
+        <w:rPr>
+          <w:rFonts w:ascii="Times New Roman" w:eastAsia="標楷體" w:hAnsi="Times New Roman" w:cs="Times New Roman" w:hint="eastAsia"/>
+          <w:kern w:val="0"/>
+          <w:szCs w:val="24"/>
+        </w:rPr>
+      </w:pPr>
+      <w:r>
+        <w:rPr>
+          <w:rFonts w:ascii="Times New Roman" w:eastAsia="標楷體" w:hAnsi="Times New Roman" w:cs="Times New Roman" w:hint="eastAsia"/>
+          <w:kern w:val="0"/>
+          <w:szCs w:val="24"/>
+        </w:rPr>
+        <w:t>承租人應依約定日期，支付租金；無約定者，依習慣；無約定亦無習慣者，應於租賃期滿時支付之。如租金分期支付者，於每期屆滿時支付之。如租賃物之收益有季節者，於收益季節終了時支付之。</w:t>
+      </w:r>
+    </w:p>
+    <w:p>
+      <w:pPr>
+        <w:widowControl/>
+        <w:shd w:val="clear" w:color="auto" w:fill="FFFFFF"/>
+        <w:rPr>
+          <w:rFonts w:ascii="Times New Roman" w:eastAsia="標楷體" w:hAnsi="Times New Roman" w:cs="Times New Roman" w:hint="eastAsia"/>
+          <w:kern w:val="0"/>
+          <w:szCs w:val="24"/>
+        </w:rPr>
+      </w:pPr>
+      <w:r>
+        <w:rPr>
+          <w:rFonts w:ascii="Times New Roman" w:eastAsia="標楷體" w:hAnsi="Times New Roman" w:cs="Times New Roman" w:hint="eastAsia"/>
+          <w:kern w:val="0"/>
+          <w:szCs w:val="24"/>
+        </w:rPr>
+        <w:t>第</w:t>
+      </w:r>
+      <w:r>
+        <w:rPr>
+          <w:rFonts w:ascii="Times New Roman" w:eastAsia="標楷體" w:hAnsi="Times New Roman" w:cs="Times New Roman" w:hint="eastAsia"/>
+          <w:kern w:val="0"/>
+          <w:szCs w:val="24"/>
+        </w:rPr>
+        <w:t xml:space="preserve"> 441 </w:t>
+      </w:r>
+      <w:r>
+        <w:rPr>
+          <w:rFonts w:ascii="Times New Roman" w:eastAsia="標楷體" w:hAnsi="Times New Roman" w:cs="Times New Roman" w:hint="eastAsia"/>
+          <w:kern w:val="0"/>
+          <w:szCs w:val="24"/>
+        </w:rPr>
+        <w:t>條</w:t>
+      </w:r>
+    </w:p>
+    <w:p>
+      <w:pPr>
+        <w:widowControl/>
+        <w:shd w:val="clear" w:color="auto" w:fill="FFFFFF"/>
+        <w:rPr>
+          <w:rFonts w:ascii="Times New Roman" w:eastAsia="標楷體" w:hAnsi="Times New Roman" w:cs="Times New Roman" w:hint="eastAsia"/>
+          <w:kern w:val="0"/>
+          <w:szCs w:val="24"/>
+        </w:rPr>
+      </w:pPr>
+      <w:r>
+        <w:rPr>
+          <w:rFonts w:ascii="Times New Roman" w:eastAsia="標楷體" w:hAnsi="Times New Roman" w:cs="Times New Roman" w:hint="eastAsia"/>
+          <w:kern w:val="0"/>
+          <w:szCs w:val="24"/>
+        </w:rPr>
+        <w:t>承租人因自己之事由，致不能為租賃物全部或一部之使用、收益者，不得免其支付租金之義務。</w:t>
+      </w:r>
+    </w:p>
+    <w:p>
+      <w:pPr>
+        <w:widowControl/>
+        <w:shd w:val="clear" w:color="auto" w:fill="FFFFFF"/>
+        <w:rPr>
+          <w:rFonts w:ascii="Times New Roman" w:eastAsia="標楷體" w:hAnsi="Times New Roman" w:cs="Times New Roman" w:hint="eastAsia"/>
+          <w:kern w:val="0"/>
+          <w:szCs w:val="24"/>
+        </w:rPr>
+      </w:pPr>
+      <w:r>
+        <w:rPr>
+          <w:rFonts w:ascii="Times New Roman" w:eastAsia="標楷體" w:hAnsi="Times New Roman" w:cs="Times New Roman" w:hint="eastAsia"/>
+          <w:kern w:val="0"/>
+          <w:szCs w:val="24"/>
+        </w:rPr>
+        <w:t>第</w:t>
+      </w:r>
+      <w:r>
+        <w:rPr>
+          <w:rFonts w:ascii="Times New Roman" w:eastAsia="標楷體" w:hAnsi="Times New Roman" w:cs="Times New Roman" w:hint="eastAsia"/>
+          <w:kern w:val="0"/>
+          <w:szCs w:val="24"/>
+        </w:rPr>
+        <w:t xml:space="preserve"> 444 </w:t>
+      </w:r>
+      <w:r>
+        <w:rPr>
+          <w:rFonts w:ascii="Times New Roman" w:eastAsia="標楷體" w:hAnsi="Times New Roman" w:cs="Times New Roman" w:hint="eastAsia"/>
+          <w:kern w:val="0"/>
+          <w:szCs w:val="24"/>
+        </w:rPr>
+        <w:t>條</w:t>
+      </w:r>
+    </w:p>
+    <w:p>
+      <w:pPr>
+        <w:widowControl/>
+        <w:shd w:val="clear" w:color="auto" w:fill="FFFFFF"/>
+        <w:rPr>
+          <w:rFonts w:ascii="Times New Roman" w:eastAsia="標楷體" w:hAnsi="Times New Roman" w:cs="Times New Roman" w:hint="eastAsia"/>
+          <w:kern w:val="0"/>
+          <w:szCs w:val="24"/>
+        </w:rPr>
+      </w:pPr>
+      <w:r>
+        <w:rPr>
+          <w:rFonts w:ascii="Times New Roman" w:eastAsia="標楷體" w:hAnsi="Times New Roman" w:cs="Times New Roman" w:hint="eastAsia"/>
+          <w:kern w:val="0"/>
+          <w:szCs w:val="24"/>
+        </w:rPr>
+        <w:t>承租人依前條之規定，將租賃物轉租於他人者，其與出租人間之租賃關係，仍為繼續。</w:t>
+      </w:r>
+    </w:p>
+    <w:p>
+      <w:pPr>
+        <w:widowControl/>
+        <w:shd w:val="clear" w:color="auto" w:fill="FFFFFF"/>
+        <w:rPr>
+          <w:rFonts w:ascii="Times New Roman" w:eastAsia="標楷體" w:hAnsi="Times New Roman" w:cs="Times New Roman" w:hint="eastAsia"/>
+          <w:kern w:val="0"/>
+          <w:szCs w:val="24"/>
+        </w:rPr>
+      </w:pPr>
+      <w:proofErr w:type="gramStart"/>
+      <w:r>
+        <w:rPr>
+          <w:rFonts w:ascii="Times New Roman" w:eastAsia="標楷體" w:hAnsi="Times New Roman" w:cs="Times New Roman" w:hint="eastAsia"/>
+          <w:kern w:val="0"/>
+          <w:szCs w:val="24"/>
+        </w:rPr>
+        <w:t>因次承租人</w:t>
+      </w:r>
+      <w:proofErr w:type="gramEnd"/>
+      <w:r>
+        <w:rPr>
+          <w:rFonts w:ascii="Times New Roman" w:eastAsia="標楷體" w:hAnsi="Times New Roman" w:cs="Times New Roman" w:hint="eastAsia"/>
+          <w:kern w:val="0"/>
+          <w:szCs w:val="24"/>
+        </w:rPr>
+        <w:t>應負責之事由所生之損害，承租人負賠償責任。</w:t>
+      </w:r>
+    </w:p>
+    <w:p>
+      <w:pPr>
+        <w:widowControl/>
+        <w:shd w:val="clear" w:color="auto" w:fill="FFFFFF"/>
+        <w:rPr>
+          <w:rFonts w:ascii="Times New Roman" w:eastAsia="標楷體" w:hAnsi="Times New Roman" w:cs="Times New Roman" w:hint="eastAsia"/>
+          <w:kern w:val="0"/>
+          <w:szCs w:val="24"/>
+        </w:rPr>
+      </w:pPr>
+      <w:r>
+        <w:rPr>
+          <w:rFonts w:ascii="Times New Roman" w:eastAsia="標楷體" w:hAnsi="Times New Roman" w:cs="Times New Roman" w:hint="eastAsia"/>
+          <w:kern w:val="0"/>
+          <w:szCs w:val="24"/>
+        </w:rPr>
+        <w:t>第</w:t>
+      </w:r>
+      <w:r>
+        <w:rPr>
+          <w:rFonts w:ascii="Times New Roman" w:eastAsia="標楷體" w:hAnsi="Times New Roman" w:cs="Times New Roman" w:hint="eastAsia"/>
+          <w:kern w:val="0"/>
+          <w:szCs w:val="24"/>
+        </w:rPr>
+        <w:t xml:space="preserve"> 446 </w:t>
+      </w:r>
+      <w:r>
+        <w:rPr>
+          <w:rFonts w:ascii="Times New Roman" w:eastAsia="標楷體" w:hAnsi="Times New Roman" w:cs="Times New Roman" w:hint="eastAsia"/>
+          <w:kern w:val="0"/>
+          <w:szCs w:val="24"/>
+        </w:rPr>
+        <w:t>條</w:t>
+      </w:r>
+    </w:p>
+    <w:p>
+      <w:pPr>
+        <w:widowControl/>
+        <w:shd w:val="clear" w:color="auto" w:fill="FFFFFF"/>
+        <w:rPr>
+          <w:rFonts w:ascii="Times New Roman" w:eastAsia="標楷體" w:hAnsi="Times New Roman" w:cs="Times New Roman" w:hint="eastAsia"/>
+          <w:kern w:val="0"/>
+          <w:szCs w:val="24"/>
+        </w:rPr>
+      </w:pPr>
+      <w:r>
+        <w:rPr>
+          <w:rFonts w:ascii="Times New Roman" w:eastAsia="標楷體" w:hAnsi="Times New Roman" w:cs="Times New Roman" w:hint="eastAsia"/>
+          <w:kern w:val="0"/>
+          <w:szCs w:val="24"/>
+        </w:rPr>
+        <w:t>承租人將前條</w:t>
+      </w:r>
+      <w:proofErr w:type="gramStart"/>
+      <w:r>
+        <w:rPr>
+          <w:rFonts w:ascii="Times New Roman" w:eastAsia="標楷體" w:hAnsi="Times New Roman" w:cs="Times New Roman" w:hint="eastAsia"/>
+          <w:kern w:val="0"/>
+          <w:szCs w:val="24"/>
+        </w:rPr>
+        <w:t>留置物取去</w:t>
+      </w:r>
+      <w:proofErr w:type="gramEnd"/>
+      <w:r>
+        <w:rPr>
+          <w:rFonts w:ascii="Times New Roman" w:eastAsia="標楷體" w:hAnsi="Times New Roman" w:cs="Times New Roman" w:hint="eastAsia"/>
+          <w:kern w:val="0"/>
+          <w:szCs w:val="24"/>
+        </w:rPr>
+        <w:t>者，出租人之留置權消滅。但其</w:t>
+      </w:r>
+      <w:proofErr w:type="gramStart"/>
+      <w:r>
+        <w:rPr>
+          <w:rFonts w:ascii="Times New Roman" w:eastAsia="標楷體" w:hAnsi="Times New Roman" w:cs="Times New Roman" w:hint="eastAsia"/>
+          <w:kern w:val="0"/>
+          <w:szCs w:val="24"/>
+        </w:rPr>
+        <w:t>取去係乘</w:t>
+      </w:r>
+      <w:proofErr w:type="gramEnd"/>
+      <w:r>
+        <w:rPr>
+          <w:rFonts w:ascii="Times New Roman" w:eastAsia="標楷體" w:hAnsi="Times New Roman" w:cs="Times New Roman" w:hint="eastAsia"/>
+          <w:kern w:val="0"/>
+          <w:szCs w:val="24"/>
+        </w:rPr>
+        <w:t>出租人之不知，或出租人曾提出異議者，不在此限。</w:t>
+      </w:r>
+    </w:p>
+    <w:p>
+      <w:pPr>
+        <w:widowControl/>
+        <w:shd w:val="clear" w:color="auto" w:fill="FFFFFF"/>
+        <w:rPr>
+          <w:rFonts w:ascii="Times New Roman" w:eastAsia="標楷體" w:hAnsi="Times New Roman" w:cs="Times New Roman" w:hint="eastAsia"/>
+          <w:kern w:val="0"/>
+          <w:szCs w:val="24"/>
+        </w:rPr>
+      </w:pPr>
+      <w:r>
+        <w:rPr>
+          <w:rFonts w:ascii="Times New Roman" w:eastAsia="標楷體" w:hAnsi="Times New Roman" w:cs="Times New Roman" w:hint="eastAsia"/>
+          <w:kern w:val="0"/>
+          <w:szCs w:val="24"/>
+        </w:rPr>
+        <w:lastRenderedPageBreak/>
+        <w:t>承租人如因執行業務取去其物，或其取去適於通常之生活關係，或所留之物足以擔保租金之支付者，出租人不得提出異議。</w:t>
+      </w:r>
+    </w:p>
+    <w:p>
+      <w:pPr>
+        <w:widowControl/>
+        <w:shd w:val="clear" w:color="auto" w:fill="FFFFFF"/>
+        <w:rPr>
+          <w:rFonts w:ascii="Times New Roman" w:eastAsia="標楷體" w:hAnsi="Times New Roman" w:cs="Times New Roman" w:hint="eastAsia"/>
+          <w:kern w:val="0"/>
+          <w:szCs w:val="24"/>
+        </w:rPr>
+      </w:pPr>
+      <w:r>
+        <w:rPr>
+          <w:rFonts w:ascii="Times New Roman" w:eastAsia="標楷體" w:hAnsi="Times New Roman" w:cs="Times New Roman" w:hint="eastAsia"/>
+          <w:kern w:val="0"/>
+          <w:szCs w:val="24"/>
+        </w:rPr>
+        <w:t>第</w:t>
+      </w:r>
+      <w:r>
+        <w:rPr>
+          <w:rFonts w:ascii="Times New Roman" w:eastAsia="標楷體" w:hAnsi="Times New Roman" w:cs="Times New Roman" w:hint="eastAsia"/>
+          <w:kern w:val="0"/>
+          <w:szCs w:val="24"/>
+        </w:rPr>
+        <w:t xml:space="preserve"> 448 </w:t>
+      </w:r>
+      <w:r>
+        <w:rPr>
+          <w:rFonts w:ascii="Times New Roman" w:eastAsia="標楷體" w:hAnsi="Times New Roman" w:cs="Times New Roman" w:hint="eastAsia"/>
+          <w:kern w:val="0"/>
+          <w:szCs w:val="24"/>
+        </w:rPr>
+        <w:t>條</w:t>
+      </w:r>
+    </w:p>
+    <w:p>
+      <w:pPr>
+        <w:widowControl/>
+        <w:shd w:val="clear" w:color="auto" w:fill="FFFFFF"/>
+        <w:rPr>
+          <w:rFonts w:ascii="Times New Roman" w:eastAsia="標楷體" w:hAnsi="Times New Roman" w:cs="Times New Roman" w:hint="eastAsia"/>
+          <w:kern w:val="0"/>
+          <w:szCs w:val="24"/>
+        </w:rPr>
+      </w:pPr>
+      <w:r>
+        <w:rPr>
+          <w:rFonts w:ascii="Times New Roman" w:eastAsia="標楷體" w:hAnsi="Times New Roman" w:cs="Times New Roman" w:hint="eastAsia"/>
+          <w:kern w:val="0"/>
+          <w:szCs w:val="24"/>
+        </w:rPr>
+        <w:t>承租人得提出擔保，以免出租人行使留置權，並得提出與各個留置物價值相當之擔保，以消滅對於該物之留置權。</w:t>
+      </w:r>
+    </w:p>
+    <w:p>
+      <w:pPr>
+        <w:widowControl/>
+        <w:shd w:val="clear" w:color="auto" w:fill="FFFFFF"/>
+        <w:rPr>
+          <w:rFonts w:ascii="Times New Roman" w:eastAsia="標楷體" w:hAnsi="Times New Roman" w:cs="Times New Roman" w:hint="eastAsia"/>
+          <w:kern w:val="0"/>
+          <w:szCs w:val="24"/>
+        </w:rPr>
+      </w:pPr>
+      <w:r>
+        <w:rPr>
+          <w:rFonts w:ascii="Times New Roman" w:eastAsia="標楷體" w:hAnsi="Times New Roman" w:cs="Times New Roman" w:hint="eastAsia"/>
+          <w:kern w:val="0"/>
+          <w:szCs w:val="24"/>
+        </w:rPr>
+        <w:t>第</w:t>
+      </w:r>
+      <w:r>
+        <w:rPr>
+          <w:rFonts w:ascii="Times New Roman" w:eastAsia="標楷體" w:hAnsi="Times New Roman" w:cs="Times New Roman" w:hint="eastAsia"/>
+          <w:kern w:val="0"/>
+          <w:szCs w:val="24"/>
+        </w:rPr>
+        <w:t xml:space="preserve"> 451 </w:t>
+      </w:r>
+      <w:r>
+        <w:rPr>
+          <w:rFonts w:ascii="Times New Roman" w:eastAsia="標楷體" w:hAnsi="Times New Roman" w:cs="Times New Roman" w:hint="eastAsia"/>
+          <w:kern w:val="0"/>
+          <w:szCs w:val="24"/>
+        </w:rPr>
+        <w:t>條</w:t>
+      </w:r>
+    </w:p>
+    <w:p>
+      <w:pPr>
+        <w:widowControl/>
+        <w:shd w:val="clear" w:color="auto" w:fill="FFFFFF"/>
+        <w:rPr>
+          <w:rFonts w:ascii="Times New Roman" w:eastAsia="標楷體" w:hAnsi="Times New Roman" w:cs="Times New Roman" w:hint="eastAsia"/>
+          <w:kern w:val="0"/>
+          <w:szCs w:val="24"/>
+        </w:rPr>
+      </w:pPr>
+      <w:r>
+        <w:rPr>
+          <w:rFonts w:ascii="Times New Roman" w:eastAsia="標楷體" w:hAnsi="Times New Roman" w:cs="Times New Roman" w:hint="eastAsia"/>
+          <w:kern w:val="0"/>
+          <w:szCs w:val="24"/>
+        </w:rPr>
+        <w:t>租賃期限屆滿後，承租人仍為租賃物之使用收益，而出租人</w:t>
+      </w:r>
+      <w:proofErr w:type="gramStart"/>
+      <w:r>
+        <w:rPr>
+          <w:rFonts w:ascii="Times New Roman" w:eastAsia="標楷體" w:hAnsi="Times New Roman" w:cs="Times New Roman" w:hint="eastAsia"/>
+          <w:kern w:val="0"/>
+          <w:szCs w:val="24"/>
+        </w:rPr>
+        <w:t>不</w:t>
+      </w:r>
+      <w:proofErr w:type="gramEnd"/>
+      <w:r>
+        <w:rPr>
+          <w:rFonts w:ascii="Times New Roman" w:eastAsia="標楷體" w:hAnsi="Times New Roman" w:cs="Times New Roman" w:hint="eastAsia"/>
+          <w:kern w:val="0"/>
+          <w:szCs w:val="24"/>
+        </w:rPr>
+        <w:t>即表示反對之意思者，視為以不定期限繼續契約。</w:t>
+      </w:r>
+    </w:p>
+    <w:p>
+      <w:pPr>
+        <w:widowControl/>
+        <w:shd w:val="clear" w:color="auto" w:fill="FFFFFF"/>
+        <w:rPr>
+          <w:rFonts w:ascii="Times New Roman" w:eastAsia="標楷體" w:hAnsi="Times New Roman" w:cs="Times New Roman" w:hint="eastAsia"/>
+          <w:kern w:val="0"/>
+          <w:szCs w:val="24"/>
+        </w:rPr>
+      </w:pPr>
+      <w:r>
+        <w:rPr>
+          <w:rFonts w:ascii="Times New Roman" w:eastAsia="標楷體" w:hAnsi="Times New Roman" w:cs="Times New Roman" w:hint="eastAsia"/>
+          <w:kern w:val="0"/>
+          <w:szCs w:val="24"/>
+        </w:rPr>
+        <w:t>第</w:t>
+      </w:r>
+      <w:r>
+        <w:rPr>
+          <w:rFonts w:ascii="Times New Roman" w:eastAsia="標楷體" w:hAnsi="Times New Roman" w:cs="Times New Roman" w:hint="eastAsia"/>
+          <w:kern w:val="0"/>
+          <w:szCs w:val="24"/>
+        </w:rPr>
+        <w:t xml:space="preserve"> 452 </w:t>
+      </w:r>
+      <w:r>
+        <w:rPr>
+          <w:rFonts w:ascii="Times New Roman" w:eastAsia="標楷體" w:hAnsi="Times New Roman" w:cs="Times New Roman" w:hint="eastAsia"/>
+          <w:kern w:val="0"/>
+          <w:szCs w:val="24"/>
+        </w:rPr>
+        <w:t>條</w:t>
+      </w:r>
+    </w:p>
+    <w:p>
+      <w:pPr>
+        <w:widowControl/>
+        <w:shd w:val="clear" w:color="auto" w:fill="FFFFFF"/>
+        <w:rPr>
+          <w:rFonts w:ascii="Times New Roman" w:eastAsia="標楷體" w:hAnsi="Times New Roman" w:cs="Times New Roman" w:hint="eastAsia"/>
+          <w:kern w:val="0"/>
+          <w:szCs w:val="24"/>
+        </w:rPr>
+      </w:pPr>
+      <w:r>
+        <w:rPr>
+          <w:rFonts w:ascii="Times New Roman" w:eastAsia="標楷體" w:hAnsi="Times New Roman" w:cs="Times New Roman" w:hint="eastAsia"/>
+          <w:kern w:val="0"/>
+          <w:szCs w:val="24"/>
+        </w:rPr>
+        <w:t>承租人死亡者，租賃契約雖定有期限，其繼承人仍得終止契約。但應依第四百五十條第三項之規定，先期通知。</w:t>
+      </w:r>
+    </w:p>
+    <w:p>
+      <w:pPr>
+        <w:widowControl/>
+        <w:shd w:val="clear" w:color="auto" w:fill="FFFFFF"/>
+        <w:rPr>
+          <w:rFonts w:ascii="Times New Roman" w:eastAsia="標楷體" w:hAnsi="Times New Roman" w:cs="Times New Roman" w:hint="eastAsia"/>
+          <w:kern w:val="0"/>
+          <w:szCs w:val="24"/>
+        </w:rPr>
+      </w:pPr>
+      <w:r>
+        <w:rPr>
+          <w:rFonts w:ascii="Times New Roman" w:eastAsia="標楷體" w:hAnsi="Times New Roman" w:cs="Times New Roman" w:hint="eastAsia"/>
+          <w:kern w:val="0"/>
+          <w:szCs w:val="24"/>
+        </w:rPr>
+        <w:t>第</w:t>
+      </w:r>
+      <w:r>
+        <w:rPr>
+          <w:rFonts w:ascii="Times New Roman" w:eastAsia="標楷體" w:hAnsi="Times New Roman" w:cs="Times New Roman" w:hint="eastAsia"/>
+          <w:kern w:val="0"/>
+          <w:szCs w:val="24"/>
+        </w:rPr>
+        <w:t xml:space="preserve"> 453 </w:t>
+      </w:r>
+      <w:r>
+        <w:rPr>
+          <w:rFonts w:ascii="Times New Roman" w:eastAsia="標楷體" w:hAnsi="Times New Roman" w:cs="Times New Roman" w:hint="eastAsia"/>
+          <w:kern w:val="0"/>
+          <w:szCs w:val="24"/>
+        </w:rPr>
+        <w:t>條</w:t>
+      </w:r>
+    </w:p>
+    <w:p>
+      <w:pPr>
+        <w:widowControl/>
+        <w:shd w:val="clear" w:color="auto" w:fill="FFFFFF"/>
+        <w:rPr>
+          <w:rFonts w:ascii="Times New Roman" w:eastAsia="標楷體" w:hAnsi="Times New Roman" w:cs="Times New Roman" w:hint="eastAsia"/>
+          <w:kern w:val="0"/>
+          <w:szCs w:val="24"/>
+        </w:rPr>
+      </w:pPr>
+      <w:r>
+        <w:rPr>
+          <w:rFonts w:ascii="Times New Roman" w:eastAsia="標楷體" w:hAnsi="Times New Roman" w:cs="Times New Roman" w:hint="eastAsia"/>
+          <w:kern w:val="0"/>
+          <w:szCs w:val="24"/>
+        </w:rPr>
+        <w:t>定有期限之租賃契約，如約定當事人之一方於期限屆滿前，得終止契約者，其終止契約，應依第四百五十條第三項之規定，先期通知。</w:t>
+      </w:r>
+    </w:p>
+    <w:p>
+      <w:pPr>
+        <w:widowControl/>
+        <w:shd w:val="clear" w:color="auto" w:fill="FFFFFF"/>
+        <w:rPr>
+          <w:rFonts w:ascii="Times New Roman" w:eastAsia="標楷體" w:hAnsi="Times New Roman" w:cs="Times New Roman" w:hint="eastAsia"/>
+          <w:kern w:val="0"/>
+          <w:szCs w:val="24"/>
+        </w:rPr>
+      </w:pPr>
+      <w:r>
+        <w:rPr>
+          <w:rFonts w:ascii="Times New Roman" w:eastAsia="標楷體" w:hAnsi="Times New Roman" w:cs="Times New Roman" w:hint="eastAsia"/>
+          <w:kern w:val="0"/>
+          <w:szCs w:val="24"/>
+        </w:rPr>
+        <w:t>第</w:t>
+      </w:r>
+      <w:r>
+        <w:rPr>
+          <w:rFonts w:ascii="Times New Roman" w:eastAsia="標楷體" w:hAnsi="Times New Roman" w:cs="Times New Roman" w:hint="eastAsia"/>
+          <w:kern w:val="0"/>
+          <w:szCs w:val="24"/>
+        </w:rPr>
+        <w:t xml:space="preserve"> 454 </w:t>
+      </w:r>
+      <w:r>
+        <w:rPr>
+          <w:rFonts w:ascii="Times New Roman" w:eastAsia="標楷體" w:hAnsi="Times New Roman" w:cs="Times New Roman" w:hint="eastAsia"/>
+          <w:kern w:val="0"/>
+          <w:szCs w:val="24"/>
+        </w:rPr>
+        <w:t>條</w:t>
+      </w:r>
+    </w:p>
+    <w:p>
+      <w:pPr>
+        <w:widowControl/>
+        <w:shd w:val="clear" w:color="auto" w:fill="FFFFFF"/>
+        <w:rPr>
+          <w:rFonts w:ascii="Times New Roman" w:eastAsia="標楷體" w:hAnsi="Times New Roman" w:cs="Times New Roman" w:hint="eastAsia"/>
+          <w:kern w:val="0"/>
+          <w:szCs w:val="24"/>
+        </w:rPr>
+      </w:pPr>
+      <w:r>
+        <w:rPr>
+          <w:rFonts w:ascii="Times New Roman" w:eastAsia="標楷體" w:hAnsi="Times New Roman" w:cs="Times New Roman" w:hint="eastAsia"/>
+          <w:kern w:val="0"/>
+          <w:szCs w:val="24"/>
+        </w:rPr>
+        <w:t>租賃契約，依前二條之規定終止時，如終止後始到期之租金，出租人已預先受領者，應返還之。</w:t>
+      </w:r>
+    </w:p>
+    <w:p>
+      <w:pPr>
+        <w:widowControl/>
+        <w:shd w:val="clear" w:color="auto" w:fill="FFFFFF"/>
+        <w:rPr>
+          <w:rFonts w:ascii="Times New Roman" w:eastAsia="標楷體" w:hAnsi="Times New Roman" w:cs="Times New Roman" w:hint="eastAsia"/>
+          <w:kern w:val="0"/>
+          <w:szCs w:val="24"/>
+        </w:rPr>
+      </w:pPr>
+      <w:r>
+        <w:rPr>
+          <w:rFonts w:ascii="Times New Roman" w:eastAsia="標楷體" w:hAnsi="Times New Roman" w:cs="Times New Roman" w:hint="eastAsia"/>
+          <w:kern w:val="0"/>
+          <w:szCs w:val="24"/>
+        </w:rPr>
+        <w:t>第</w:t>
+      </w:r>
+      <w:r>
+        <w:rPr>
+          <w:rFonts w:ascii="Times New Roman" w:eastAsia="標楷體" w:hAnsi="Times New Roman" w:cs="Times New Roman" w:hint="eastAsia"/>
+          <w:kern w:val="0"/>
+          <w:szCs w:val="24"/>
+        </w:rPr>
+        <w:t xml:space="preserve"> 455 </w:t>
+      </w:r>
+      <w:r>
+        <w:rPr>
+          <w:rFonts w:ascii="Times New Roman" w:eastAsia="標楷體" w:hAnsi="Times New Roman" w:cs="Times New Roman" w:hint="eastAsia"/>
+          <w:kern w:val="0"/>
+          <w:szCs w:val="24"/>
+        </w:rPr>
+        <w:t>條</w:t>
+      </w:r>
+    </w:p>
+    <w:p>
+      <w:pPr>
+        <w:widowControl/>
+        <w:shd w:val="clear" w:color="auto" w:fill="FFFFFF"/>
+        <w:rPr>
+          <w:rFonts w:ascii="Times New Roman" w:eastAsia="標楷體" w:hAnsi="Times New Roman" w:cs="Times New Roman" w:hint="eastAsia"/>
+          <w:kern w:val="0"/>
+          <w:szCs w:val="24"/>
+        </w:rPr>
+      </w:pPr>
+      <w:r>
+        <w:rPr>
+          <w:rFonts w:ascii="Times New Roman" w:eastAsia="標楷體" w:hAnsi="Times New Roman" w:cs="Times New Roman" w:hint="eastAsia"/>
+          <w:kern w:val="0"/>
+          <w:szCs w:val="24"/>
+        </w:rPr>
+        <w:t>承租人於租賃關係終止後，應返還租賃物；租賃物有生產力者，並應保持其生產狀態，返還出租人。</w:t>
+      </w:r>
+    </w:p>
+    <w:p>
+      <w:pPr>
+        <w:widowControl/>
+        <w:shd w:val="clear" w:color="auto" w:fill="FFFFFF"/>
+        <w:rPr>
+          <w:rFonts w:ascii="Times New Roman" w:eastAsia="標楷體" w:hAnsi="Times New Roman" w:cs="Times New Roman" w:hint="eastAsia"/>
+          <w:kern w:val="0"/>
+          <w:szCs w:val="24"/>
+        </w:rPr>
+      </w:pPr>
+      <w:r>
+        <w:rPr>
+          <w:rFonts w:ascii="Times New Roman" w:eastAsia="標楷體" w:hAnsi="Times New Roman" w:cs="Times New Roman" w:hint="eastAsia"/>
+          <w:kern w:val="0"/>
+          <w:szCs w:val="24"/>
+        </w:rPr>
+        <w:t>第</w:t>
+      </w:r>
+      <w:r>
+        <w:rPr>
+          <w:rFonts w:ascii="Times New Roman" w:eastAsia="標楷體" w:hAnsi="Times New Roman" w:cs="Times New Roman" w:hint="eastAsia"/>
+          <w:kern w:val="0"/>
+          <w:szCs w:val="24"/>
+        </w:rPr>
+        <w:t xml:space="preserve"> 456 </w:t>
+      </w:r>
+      <w:r>
+        <w:rPr>
+          <w:rFonts w:ascii="Times New Roman" w:eastAsia="標楷體" w:hAnsi="Times New Roman" w:cs="Times New Roman" w:hint="eastAsia"/>
+          <w:kern w:val="0"/>
+          <w:szCs w:val="24"/>
+        </w:rPr>
+        <w:t>條</w:t>
+      </w:r>
+    </w:p>
+    <w:p>
+      <w:pPr>
+        <w:widowControl/>
+        <w:shd w:val="clear" w:color="auto" w:fill="FFFFFF"/>
+        <w:rPr>
+          <w:rFonts w:ascii="Times New Roman" w:eastAsia="標楷體" w:hAnsi="Times New Roman" w:cs="Times New Roman" w:hint="eastAsia"/>
+          <w:kern w:val="0"/>
+          <w:szCs w:val="24"/>
+        </w:rPr>
+      </w:pPr>
+      <w:r>
+        <w:rPr>
+          <w:rFonts w:ascii="Times New Roman" w:eastAsia="標楷體" w:hAnsi="Times New Roman" w:cs="Times New Roman" w:hint="eastAsia"/>
+          <w:kern w:val="0"/>
+          <w:szCs w:val="24"/>
+        </w:rPr>
+        <w:t>出租人就租賃物所受損害對於承租人之賠償請求權，承租人之償還費用請求權及工作物取回權，</w:t>
+      </w:r>
+      <w:proofErr w:type="gramStart"/>
+      <w:r>
+        <w:rPr>
+          <w:rFonts w:ascii="Times New Roman" w:eastAsia="標楷體" w:hAnsi="Times New Roman" w:cs="Times New Roman" w:hint="eastAsia"/>
+          <w:kern w:val="0"/>
+          <w:szCs w:val="24"/>
+        </w:rPr>
+        <w:t>均因</w:t>
+      </w:r>
+      <w:proofErr w:type="gramEnd"/>
+      <w:r>
+        <w:rPr>
+          <w:rFonts w:ascii="Times New Roman" w:eastAsia="標楷體" w:hAnsi="Times New Roman" w:cs="Times New Roman" w:hint="eastAsia"/>
+          <w:kern w:val="0"/>
+          <w:szCs w:val="24"/>
+        </w:rPr>
+        <w:t>二年間不行使而消滅。</w:t>
+      </w:r>
+    </w:p>
+    <w:p>
+      <w:pPr>
+        <w:widowControl/>
+        <w:shd w:val="clear" w:color="auto" w:fill="FFFFFF"/>
+        <w:rPr>
+          <w:rFonts w:ascii="Times New Roman" w:eastAsia="標楷體" w:hAnsi="Times New Roman" w:cs="Times New Roman" w:hint="eastAsia"/>
+          <w:kern w:val="0"/>
+          <w:szCs w:val="24"/>
+        </w:rPr>
+      </w:pPr>
+      <w:r>
+        <w:rPr>
+          <w:rFonts w:ascii="Times New Roman" w:eastAsia="標楷體" w:hAnsi="Times New Roman" w:cs="Times New Roman" w:hint="eastAsia"/>
+          <w:kern w:val="0"/>
+          <w:szCs w:val="24"/>
+        </w:rPr>
+        <w:t>前項</w:t>
+      </w:r>
+      <w:proofErr w:type="gramStart"/>
+      <w:r>
+        <w:rPr>
+          <w:rFonts w:ascii="Times New Roman" w:eastAsia="標楷體" w:hAnsi="Times New Roman" w:cs="Times New Roman" w:hint="eastAsia"/>
+          <w:kern w:val="0"/>
+          <w:szCs w:val="24"/>
+        </w:rPr>
+        <w:t>期間，</w:t>
+      </w:r>
+      <w:proofErr w:type="gramEnd"/>
+      <w:r>
+        <w:rPr>
+          <w:rFonts w:ascii="Times New Roman" w:eastAsia="標楷體" w:hAnsi="Times New Roman" w:cs="Times New Roman" w:hint="eastAsia"/>
+          <w:kern w:val="0"/>
+          <w:szCs w:val="24"/>
+        </w:rPr>
+        <w:t>於出租人，自受租賃物返還時起算。於承租人，自租賃關係終止時起算。</w:t>
+      </w:r>
+    </w:p>
+    <w:p>
+      <w:pPr>
+        <w:widowControl/>
+        <w:shd w:val="clear" w:color="auto" w:fill="FFFFFF"/>
+        <w:rPr>
+          <w:rFonts w:ascii="Times New Roman" w:eastAsia="標楷體" w:hAnsi="Times New Roman" w:cs="Times New Roman"/>
+          <w:kern w:val="0"/>
+          <w:szCs w:val="24"/>
+        </w:rPr>
+      </w:pPr>
+    </w:p>
+    <w:p>
+      <w:pPr>
+        <w:widowControl/>
+        <w:shd w:val="clear" w:color="auto" w:fill="FFFFFF"/>
+        <w:rPr>
+          <w:rFonts w:ascii="Times New Roman" w:eastAsia="標楷體" w:hAnsi="Times New Roman" w:cs="Times New Roman"/>
+          <w:kern w:val="0"/>
+          <w:szCs w:val="24"/>
+        </w:rPr>
+      </w:pPr>
+      <w:r>
+        <w:rPr>
           <w:rFonts w:ascii="Times New Roman" w:eastAsia="標楷體" w:hAnsi="Times New Roman" w:cs="Times New Roman"/>
           <w:kern w:val="0"/>
           <w:szCs w:val="24"/>
         </w:rPr>
         <w:t>綜合以上幾點評估後法律方面可行</w:t>
       </w:r>
+      <w:r>
+        <w:rPr>
+          <w:rFonts w:ascii="Times New Roman" w:eastAsia="標楷體" w:hAnsi="Times New Roman" w:cs="Times New Roman" w:hint="eastAsia"/>
+          <w:kern w:val="0"/>
+          <w:szCs w:val="24"/>
+        </w:rPr>
+        <w:t>。</w:t>
+      </w:r>
+      <w:bookmarkStart w:id="0" w:name="_GoBack"/>
+      <w:bookmarkEnd w:id="0"/>
     </w:p>
     <w:p>
       <w:pPr>
@@ -2891,6 +4453,7 @@
           <w:kern w:val="0"/>
           <w:szCs w:val="24"/>
         </w:rPr>
+        <w:lastRenderedPageBreak/>
         <w:t>綜合以上幾點評估後作業可行</w:t>
       </w:r>
     </w:p>
@@ -2956,7 +4519,6 @@
           <w:kern w:val="0"/>
           <w:szCs w:val="24"/>
         </w:rPr>
-        <w:lastRenderedPageBreak/>
         <w:tab/>
       </w:r>
       <w:r>
@@ -3614,6 +5176,7 @@
           <w:kern w:val="0"/>
           <w:szCs w:val="24"/>
         </w:rPr>
+        <w:lastRenderedPageBreak/>
         <w:t>若要針對系統功能做調整則務必要另外儲存調整前的原始系統專案以避免發生調整後的錯誤而無法回歸原狀</w:t>
       </w:r>
     </w:p>
@@ -3696,7 +5259,6 @@
         <w:rPr>
           <w:rFonts w:ascii="Times New Roman" w:eastAsia="標楷體" w:hAnsi="Times New Roman" w:cs="Times New Roman"/>
         </w:rPr>
-        <w:lastRenderedPageBreak/>
         <w:t>2</w:t>
       </w:r>
       <w:r>
@@ -3769,21 +5331,7 @@
             <w:rStyle w:val="a3"/>
             <w:rFonts w:ascii="Calibri" w:hAnsi="Calibri" w:cs="Calibri"/>
           </w:rPr>
-          <w:t>https://ittoos25.pixnet.net/blog/post/303086330-%5B%E9%9B%BB%E8%85%A6%5D-%E4%B8%80%E5%8F%B0%E9%9B%BB%E8%85%A6%E4%B8%BB%E6%A9%9F%2B%E9%9B%BB%E8%85%A6%E5%91%A8%</w:t>
-        </w:r>
-        <w:r>
-          <w:rPr>
-            <w:rStyle w:val="a3"/>
-            <w:rFonts w:ascii="Calibri" w:hAnsi="Calibri" w:cs="Calibri"/>
-          </w:rPr>
-          <w:t>E</w:t>
-        </w:r>
-        <w:r>
-          <w:rPr>
-            <w:rStyle w:val="a3"/>
-            <w:rFonts w:ascii="Calibri" w:hAnsi="Calibri" w:cs="Calibri"/>
-          </w:rPr>
-          <w:t>9%82%8A%E7%B8%BD%E5%85%B1%E8%A6%81%E5%A4%9A%E5%B0%91%E9%8C%A2%3F</w:t>
+          <w:t>https://ittoos25.pixnet.net/blog/post/303086330-%5B%E9%9B%BB%E8%85%A6%5D-%E4%B8%80%E5%8F%B0%E9%9B%BB%E8%85%A6%E4%B8%BB%E6%A9%9F%2B%E9%9B%BB%E8%85%A6%E5%91%A8%E9%82%8A%E7%B8%BD%E5%85%B1%E8%A6%81%E5%A4%9A%E5%B0%91%E9%8C%A2%3F</w:t>
         </w:r>
       </w:hyperlink>
     </w:p>
@@ -4975,7 +6523,7 @@
     <w:lsdException w:name="Table Web 2" w:semiHidden="1" w:unhideWhenUsed="1"/>
     <w:lsdException w:name="Table Web 3" w:semiHidden="1" w:unhideWhenUsed="1"/>
     <w:lsdException w:name="Balloon Text" w:semiHidden="1" w:unhideWhenUsed="1"/>
-    <w:lsdException w:name="Table Grid" w:semiHidden="1" w:uiPriority="59" w:unhideWhenUsed="1"/>
+    <w:lsdException w:name="Table Grid" w:uiPriority="59"/>
     <w:lsdException w:name="Table Theme" w:semiHidden="1" w:unhideWhenUsed="1"/>
     <w:lsdException w:name="Placeholder Text" w:semiHidden="1"/>
     <w:lsdException w:name="No Spacing" w:uiPriority="1" w:qFormat="1"/>

</xml_diff>